<commit_message>
Sync biosketch with CV
Close UNC appointment (2023-2025), add UCSD professorship, QUANTEC 2 WG,
and two UCSD leadership roles to Section B; correct MIS year (2024) and
MPWB name/year (2017); add 2024 AHRQ R-01 to Honors, adjunct UNC
appointment to Employment, and two newest invited talks. Update position
title to Clinical Assistant Professor, note COVER-ALL publication in
Section C narrative, fix Gay product journal (JACMP 12/2023), and add
the Lancet Gastroenterology & Hepatology 2025 COVER-ALL paper as a fifth
selected product.

Co-Authored-By: Claude Fable 5 <noreply@anthropic.com>
</commit_message>
<xml_diff>
--- a/Biosketch_BMA.docx
+++ b/Biosketch_BMA.docx
@@ -159,7 +159,7 @@
         <w:rPr>
           <w:sz w:val="22"/>
         </w:rPr>
-        <w:t xml:space="preserve"> Assistant Professor</w:t>
+        <w:t xml:space="preserve"> Clinical Assistant Professor</w:t>
       </w:r>
     </w:p>
     <w:p>
@@ -1316,6 +1316,62 @@
         <w:pStyle w:val="DataField11pt-Single"/>
       </w:pPr>
       <w:r>
+        <w:t xml:space="preserve">2026 – Present </w:t>
+        <w:tab/>
+        <w:t>Member: AAPM QUANTEC 2 Working Group (Q2WG)</w:t>
+      </w:r>
+      <w:r/>
+    </w:p>
+    <w:p>
+      <w:pPr>
+        <w:pStyle w:val="DataField11pt-Single"/>
+      </w:pPr>
+      <w:r>
+        <w:t xml:space="preserve">2025 – Present </w:t>
+        <w:tab/>
+        <w:t>Clinical Assistant Professor, Department of Radiation Oncology, University of California, San Diego</w:t>
+      </w:r>
+      <w:r/>
+    </w:p>
+    <w:p>
+      <w:pPr>
+        <w:pStyle w:val="DataField11pt-Single"/>
+      </w:pPr>
+      <w:r>
+        <w:t xml:space="preserve">2025 – Present </w:t>
+        <w:tab/>
+        <w:t>Chair of Technical Innovation and Implementation, University of California, San Diego</w:t>
+      </w:r>
+      <w:r/>
+    </w:p>
+    <w:p>
+      <w:pPr>
+        <w:pStyle w:val="DataField11pt-Single"/>
+      </w:pPr>
+      <w:r>
+        <w:t xml:space="preserve">2025 – Present </w:t>
+        <w:tab/>
+        <w:t>Technical Service Chief, Central Nervous System, University of California, San Diego</w:t>
+      </w:r>
+      <w:r/>
+    </w:p>
+    <w:p>
+      <w:pPr>
+        <w:pStyle w:val="DataField11pt-Single"/>
+      </w:pPr>
+      <w:r>
+        <w:t xml:space="preserve">2024 – Present </w:t>
+      </w:r>
+      <w:r>
+        <w:tab/>
+        <w:t>Member: AAPM Machine Intelligence Subcommittee</w:t>
+      </w:r>
+    </w:p>
+    <w:p>
+      <w:pPr>
+        <w:pStyle w:val="DataField11pt-Single"/>
+      </w:pPr>
+      <w:r>
         <w:rPr>
           <w:rStyle w:val="Strong"/>
           <w:b w:val="0"/>
@@ -1340,7 +1396,7 @@
         <w:pStyle w:val="DataField11pt-Single"/>
       </w:pPr>
       <w:r>
-        <w:t xml:space="preserve">2023 – Present </w:t>
+        <w:t xml:space="preserve">2023 – 2025 </w:t>
       </w:r>
       <w:r>
         <w:tab/>
@@ -1352,18 +1408,6 @@
         <w:pStyle w:val="DataField11pt-Single"/>
       </w:pPr>
       <w:r>
-        <w:t xml:space="preserve">2023 – Present </w:t>
-      </w:r>
-      <w:r>
-        <w:tab/>
-        <w:t>Member: AAPM Machine Intelligence Subcommittee</w:t>
-      </w:r>
-    </w:p>
-    <w:p>
-      <w:pPr>
-        <w:pStyle w:val="DataField11pt-Single"/>
-      </w:pPr>
-      <w:r>
         <w:t>2023 – Present</w:t>
       </w:r>
       <w:r>
@@ -1408,11 +1452,11 @@
         <w:keepLines/>
       </w:pPr>
       <w:r>
-        <w:t>2019 – Present</w:t>
+        <w:t>2017 – Present</w:t>
       </w:r>
       <w:r>
         <w:tab/>
-        <w:t>Member: Medical Physics for World Benefit (MPWB)</w:t>
+        <w:t>Member: Medical Physicists for World Benefit (MPWB)</w:t>
       </w:r>
     </w:p>
     <w:p>
@@ -1531,54 +1575,53 @@
       <w:pPr>
         <w:keepNext/>
         <w:keepLines/>
-        <w:ind w:left="360" w:hanging="360"/>
-      </w:pPr>
-      <w:r>
-        <w:t>2022</w:t>
-      </w:r>
-      <w:r>
+      </w:pPr>
+      <w:r>
+        <w:t>2024</w:t>
         <w:tab/>
-      </w:r>
-      <w:r>
-        <w:t>AAPM Jack Krohmer Early Career Investigator Competition Winner – EPIDEEP: Predicting In-Vivo EPID Transit Images – a Deep Learning Approach</w:t>
-      </w:r>
-    </w:p>
-    <w:p>
-      <w:pPr>
-        <w:ind w:left="360" w:hanging="360"/>
-      </w:pPr>
-      <w:r>
-        <w:t>202</w:t>
-      </w:r>
-      <w:r>
-        <w:t>2 and 2021</w:t>
-      </w:r>
-      <w:r>
-        <w:tab/>
-      </w:r>
-      <w:r>
-        <w:t xml:space="preserve">Alfred G. Knudson Jr. Outstanding Dissertation Award: $5,000 Award established by MD Anderson Cancer Center to honor the late Dr. Knudson in recognition of </w:t>
-      </w:r>
-      <w:r>
-        <w:t>the top selected</w:t>
-      </w:r>
-      <w:r>
-        <w:t xml:space="preserve"> PhD dissertation.</w:t>
-      </w:r>
+        <w:t>R-01, Co-Investigator: AHRQ Health Services Research Projects, University of North Carolina, Chapel Hill</w:t>
+      </w:r>
+      <w:r/>
+      <w:r/>
+      <w:r/>
     </w:p>
     <w:p>
       <w:pPr>
         <w:keepNext/>
         <w:keepLines/>
-      </w:pPr>
-      <w:r>
-        <w:t>2021</w:t>
+        <w:ind w:left="360" w:hanging="360"/>
+      </w:pPr>
+      <w:r>
+        <w:t>2022</w:t>
       </w:r>
       <w:r>
         <w:tab/>
       </w:r>
       <w:r>
-        <w:t>AAPM Practical Big Data Workshop, Early Career Investigator – Impact Award</w:t>
+        <w:t>AAPM Jack Krohmer Early Career Investigator Competition Winner – EPIDEEP: Predicting In-Vivo EPID Transit Images – a Deep Learning Approach</w:t>
+      </w:r>
+    </w:p>
+    <w:p>
+      <w:pPr>
+        <w:ind w:left="360" w:hanging="360"/>
+      </w:pPr>
+      <w:r>
+        <w:t>202</w:t>
+      </w:r>
+      <w:r>
+        <w:t>2 and 2021</w:t>
+      </w:r>
+      <w:r>
+        <w:tab/>
+      </w:r>
+      <w:r>
+        <w:t xml:space="preserve">Alfred G. Knudson Jr. Outstanding Dissertation Award: $5,000 Award established by MD Anderson Cancer Center to honor the late Dr. Knudson in recognition of </w:t>
+      </w:r>
+      <w:r>
+        <w:t>the top selected</w:t>
+      </w:r>
+      <w:r>
+        <w:t xml:space="preserve"> PhD dissertation.</w:t>
       </w:r>
     </w:p>
     <w:p>
@@ -1587,7 +1630,22 @@
         <w:keepLines/>
       </w:pPr>
       <w:r>
-        <w:t>2020</w:t>
+        <w:t>2021</w:t>
+      </w:r>
+      <w:r>
+        <w:tab/>
+      </w:r>
+      <w:r>
+        <w:t>AAPM Practical Big Data Workshop, Early Career Investigator – Impact Award</w:t>
+      </w:r>
+    </w:p>
+    <w:p>
+      <w:pPr>
+        <w:keepNext/>
+        <w:keepLines/>
+      </w:pPr>
+      <w:r>
+        <w:t>2021 and 2020</w:t>
       </w:r>
       <w:r>
         <w:tab/>
@@ -1850,6 +1908,17 @@
       <w:r>
         <w:t>San Diego</w:t>
       </w:r>
+    </w:p>
+    <w:p>
+      <w:pPr>
+        <w:pStyle w:val="DataField11pt-Single"/>
+      </w:pPr>
+      <w:r>
+        <w:t>2025 – Present Adjunct Assistant Professor, University of North Carolina, Chapel Hill</w:t>
+      </w:r>
+      <w:r/>
+      <w:r/>
+      <w:r/>
     </w:p>
     <w:p>
       <w:pPr>
@@ -1958,6 +2027,34 @@
         </w:numPr>
       </w:pPr>
       <w:r>
+        <w:t>Winter Institute of Medical Physics (WIMP): “Making the Schedule: Optimizing Fairness as Best We Can” (02/2026)</w:t>
+      </w:r>
+      <w:r/>
+      <w:r/>
+    </w:p>
+    <w:p>
+      <w:pPr>
+        <w:pStyle w:val="DataField11pt-Single"/>
+        <w:numPr>
+          <w:ilvl w:val="0"/>
+          <w:numId w:val="21"/>
+        </w:numPr>
+      </w:pPr>
+      <w:r>
+        <w:t>Massachusetts General Hospital &amp; Brigham, Radiation Oncology Medical Physics Seminar Series: “Building AI for the Clinic: When to use it and when to avoid it” (12/2025)</w:t>
+      </w:r>
+      <w:r/>
+      <w:r/>
+    </w:p>
+    <w:p>
+      <w:pPr>
+        <w:pStyle w:val="DataField11pt-Single"/>
+        <w:numPr>
+          <w:ilvl w:val="0"/>
+          <w:numId w:val="21"/>
+        </w:numPr>
+      </w:pPr>
+      <w:r>
         <w:t>MD Anderson, Image Guided Cancer Therapy Research Program &amp; CCSG Image-Guided Interventions &amp; Insights Program: “Radiation Oncology &amp; Data Science: Successes, Failures, and Lessons Learned”</w:t>
       </w:r>
       <w:r>
@@ -2239,10 +2336,10 @@
         <w:t>he successful outcomes of my doctoral research have paved the way for tangible clinical impact, including the facilitation of a phase 2 clinical trial</w:t>
       </w:r>
       <w:r>
-        <w:t xml:space="preserve"> with our interventional radiology team</w:t>
-      </w:r>
-      <w:r>
-        <w:t xml:space="preserve">. This pivotal milestone underscores </w:t>
+        <w:t xml:space="preserve"> with our interventional radiology team (COVER-ALL)</w:t>
+      </w:r>
+      <w:r>
+        <w:t xml:space="preserve">, whose results are now published in The Lancet Gastroenterology &amp; Hepatology (2025). This pivotal milestone underscores </w:t>
       </w:r>
       <w:r>
         <w:lastRenderedPageBreak/>
@@ -2307,7 +2404,7 @@
           <w:bCs/>
           <w:color w:val="000000" w:themeColor="text1"/>
         </w:rPr>
-        <w:t xml:space="preserve">Gay S, Kisling K, </w:t>
+        <w:t xml:space="preserve">Odisio B.C, Albuquerque J., Lin YM., </w:t>
       </w:r>
       <w:r>
         <w:rPr>
@@ -2315,7 +2412,7 @@
           <w:b/>
           <w:color w:val="000000" w:themeColor="text1"/>
         </w:rPr>
-        <w:t>Anderson B.M,</w:t>
+        <w:t xml:space="preserve">Anderson B.M</w:t>
       </w:r>
       <w:r>
         <w:rPr>
@@ -2323,7 +2420,7 @@
           <w:bCs/>
           <w:color w:val="000000" w:themeColor="text1"/>
         </w:rPr>
-        <w:t xml:space="preserve"> Zhang L, Rhee D.J, Nguyen C., Netherton T., Yang J., Brock K., Jhingran A., Simonds H., Klopp A., Beadle B. M., Court L., Cardenas C. </w:t>
+        <w:t xml:space="preserve">, O’Connor C.S, Rigaud B., Briones-Dimayuga M., Jones A.K., Fellman B.M, Huang S.Y., Kuban J., Metwalli Z. A., Sheth R., Habibollahi P., Patel M., Shan K. Y., Cox V. L., Kang HS. C., Morris V. K, Kopetz S., Javle M.M., Kaseb A., Tzeng CW., Cao HT., Newhook T., Chun Y. S., Vauthey JN., Gupta S., Paolucci I., Brock K.K. </w:t>
       </w:r>
       <w:r>
         <w:rPr>
@@ -2333,7 +2430,7 @@
           <w:iCs/>
           <w:color w:val="000000" w:themeColor="text1"/>
         </w:rPr>
-        <w:t>Identifying the optimal deep learning architecture and parameters for automatic beam aperture definition in 3D radiotherapy</w:t>
+        <w:t xml:space="preserve">Software-based versus visual assessment of the minimal ablative margin in patients with liver tumours undergoing percutaneous thermal ablation (COVER-ALL): a randomised controlled phase 2 trial.</w:t>
       </w:r>
       <w:r>
         <w:rPr>
@@ -2341,7 +2438,63 @@
           <w:bCs/>
           <w:color w:val="000000" w:themeColor="text1"/>
         </w:rPr>
-        <w:t xml:space="preserve"> Radiation Oncology Physics 09/2023</w:t>
+        <w:t xml:space="preserve"> The Lancet Gastroenterology &amp; Hepatology 05/2025</w:t>
+      </w:r>
+    </w:p>
+    <w:p>
+      <w:pPr>
+        <w:pStyle w:val="ListParagraph"/>
+        <w:numPr>
+          <w:ilvl w:val="0"/>
+          <w:numId w:val="20"/>
+        </w:numPr>
+        <w:spacing w:after="60"/>
+        <w:rPr>
+          <w:rFonts w:cs="Arial"/>
+          <w:color w:val="000000" w:themeColor="text1"/>
+        </w:rPr>
+      </w:pPr>
+      <w:r>
+        <w:rPr>
+          <w:rFonts w:cs="Arial"/>
+          <w:bCs/>
+          <w:color w:val="000000" w:themeColor="text1"/>
+        </w:rPr>
+        <w:t xml:space="preserve">Gay S, Kisling K, </w:t>
+      </w:r>
+      <w:r>
+        <w:rPr>
+          <w:rFonts w:cs="Arial"/>
+          <w:b/>
+          <w:color w:val="000000" w:themeColor="text1"/>
+        </w:rPr>
+        <w:t>Anderson B.M,</w:t>
+      </w:r>
+      <w:r>
+        <w:rPr>
+          <w:rFonts w:cs="Arial"/>
+          <w:bCs/>
+          <w:color w:val="000000" w:themeColor="text1"/>
+        </w:rPr>
+        <w:t xml:space="preserve"> Zhang L, Rhee D.J, Nguyen C., Netherton T., Yang J., Brock K., Jhingran A., Simonds H., Klopp A., Beadle B. M., Court L., Cardenas C. </w:t>
+      </w:r>
+      <w:r>
+        <w:rPr>
+          <w:rFonts w:cs="Arial"/>
+          <w:bCs/>
+          <w:i/>
+          <w:iCs/>
+          <w:color w:val="000000" w:themeColor="text1"/>
+        </w:rPr>
+        <w:t>Identifying the optimal deep learning architecture and parameters for automatic beam aperture definition in 3D radiotherapy</w:t>
+      </w:r>
+      <w:r>
+        <w:rPr>
+          <w:rFonts w:cs="Arial"/>
+          <w:bCs/>
+          <w:color w:val="000000" w:themeColor="text1"/>
+        </w:rPr>
+        <w:t xml:space="preserve"> Journal of Applied Clinical Medical Physics 12/2023</w:t>
       </w:r>
     </w:p>
     <w:p>

</xml_diff>